<commit_message>
sözleşme tarihi değiş eklendi
</commit_message>
<xml_diff>
--- a/app/static/arsiv/437779000388_durak_ap/Formlar/PF-2026_0051_Form.docx
+++ b/app/static/arsiv/437779000388_durak_ap/Formlar/PF-2026_0051_Form.docx
@@ -154,7 +154,7 @@
                               <w:rPr>
                                 <w:szCs w:val="28"/>
                               </w:rPr>
-                              <w:t xml:space="preserve">24.03.2026</w:t>
+                              <w:t xml:space="preserve">19.03.2026</w:t>
                             </w:r>
                           </w:p>
                           <w:p>
@@ -285,7 +285,7 @@
                         <w:rPr>
                           <w:szCs w:val="28"/>
                         </w:rPr>
-                        <w:t xml:space="preserve">24.03.2026</w:t>
+                        <w:t xml:space="preserve">19.03.2026</w:t>
                       </w:r>
                     </w:p>
                     <w:p>

</xml_diff>